<commit_message>
Update the Embedded, Hosted Session + 3DS and Click to Pay guides for TechGear
Each guide (now v1.1.0) walks through the TechGear storefront version of its
demo: browse, cart, checkout, payment inside the TechGear Payment step,
3-D Secure or Click to Pay verification, the TechGear receipt, and the
Developer view. Screenshots replaced. The Click to Pay card-list and review
steps reuse the previous screenshots, cropped to the Click to Pay window,
since completing a wallet payment needs a registered profile.

Co-Authored-By: Claude Opus 5.5 <noreply@anthropic.com>
</commit_message>
<xml_diff>
--- a/public/guides/click-to-pay-hosted-session.docx
+++ b/public/guides/click-to-pay-hosted-session.docx
@@ -35,7 +35,7 @@
           <w:b/>
           <w:sz w:val="22"/>
         </w:rPr>
-        <w:t>Version 1.0.0</w:t>
+        <w:t>Version 1.1.0</w:t>
       </w:r>
     </w:p>
     <w:p/>
@@ -60,7 +60,7 @@
           <w:color w:val="000000"/>
           <w:sz w:val="22"/>
         </w:rPr>
-        <w:t>This document is a step-by-step guide for Sales and CTS (Customer Technical Support) teams to validate this payment scenario in the Mastercard Gateway MTF (Merchant Test Facility) environment.</w:t>
+        <w:t xml:space="preserve">This document is a step-by-step guide for Sales and CTS (Customer Technical Support) teams to validate this payment scenario in the Mastercard Gateway MTF (Merchant Test Facility) environment.</w:t>
       </w:r>
     </w:p>
     <w:p>
@@ -72,7 +72,7 @@
           <w:color w:val="000000"/>
           <w:sz w:val="22"/>
         </w:rPr>
-        <w:t>This flow demonstrates a Click to Pay (secure remote commerce) checkout built on a Mastercard Gateway Hosted Session. The shopper identifies with their email, verifies with a one-time code, and pays with a card saved in their Click to Pay wallet. A Network Console traces the gateway API calls behind the transaction.</w:t>
+        <w:t xml:space="preserve">This flow demonstrates a Click to Pay (secure remote commerce) checkout built on a Mastercard Gateway Hosted Session. The demo is set in TechGear, a sample hardware store: the shopper fills a cart, identifies with their email at checkout, verifies with a one-time code and pays with a card saved in their Click to Pay wallet — all inside the TechGear checkout. A Developer view traces the gateway API calls behind the transaction.</w:t>
       </w:r>
     </w:p>
     <w:p>
@@ -108,7 +108,7 @@
           <w:color w:val="000000"/>
           <w:sz w:val="22"/>
         </w:rPr>
-        <w:t>Open Configuration Settings and provide the Merchant ID, API username/password, API Base URL and API Version, then Save Configuration.</w:t>
+        <w:t xml:space="preserve">Open Store Settings — from the person icon in the header, the gear button, or Gateway settings in the Demo strip — and provide the Merchant ID, API username/password, API Base URL and API Version, then select Save Configuration. The Current Status panel shows which merchant and gateway are active.</w:t>
       </w:r>
     </w:p>
     <w:p>
@@ -128,7 +128,61 @@
           <w:color w:val="C00000"/>
           <w:sz w:val="22"/>
         </w:rPr>
-        <w:t>API credentials are stored locally in your browser and sent to the demo backend to call the gateway. Use integration/test credentials only.</w:t>
+        <w:t xml:space="preserve">API credentials are stored locally in your browser and sent to the demo backend to call the gateway. Use integration/test credentials only.</w:t>
+      </w:r>
+    </w:p>
+    <w:p>
+      <w:pPr>
+        <w:spacing w:before="80"/>
+        <w:jc w:val="center"/>
+      </w:pPr>
+      <w:r>
+        <w:drawing>
+          <wp:inline xmlns:a="http://schemas.openxmlformats.org/drawingml/2006/main" xmlns:pic="http://schemas.openxmlformats.org/drawingml/2006/picture">
+            <wp:extent cx="6400800" cy="4112514"/>
+            <wp:docPr id="1" name="Picture 1"/>
+            <wp:cNvGraphicFramePr>
+              <a:graphicFrameLocks noChangeAspect="1"/>
+            </wp:cNvGraphicFramePr>
+            <a:graphic>
+              <a:graphicData uri="http://schemas.openxmlformats.org/drawingml/2006/picture">
+                <pic:pic>
+                  <pic:nvPicPr>
+                    <pic:cNvPr id="0" name="image1.png"/>
+                    <pic:cNvPicPr/>
+                  </pic:nvPicPr>
+                  <pic:blipFill>
+                    <a:blip r:embed="rIdImg1"/>
+                    <a:stretch>
+                      <a:fillRect/>
+                    </a:stretch>
+                  </pic:blipFill>
+                  <pic:spPr>
+                    <a:xfrm>
+                      <a:off x="0" y="0"/>
+                      <a:ext cx="6400800" cy="4112514"/>
+                    </a:xfrm>
+                    <a:prstGeom prst="rect"/>
+                  </pic:spPr>
+                </pic:pic>
+              </a:graphicData>
+            </a:graphic>
+          </wp:inline>
+        </w:drawing>
+      </w:r>
+    </w:p>
+    <w:p>
+      <w:pPr>
+        <w:spacing w:after="200"/>
+        <w:jc w:val="center"/>
+      </w:pPr>
+      <w:r>
+        <w:rPr>
+          <w:i/>
+          <w:color w:val="595959"/>
+          <w:sz w:val="18"/>
+        </w:rPr>
+        <w:t xml:space="preserve">Store Settings — gateway credentials and current status.</w:t>
       </w:r>
     </w:p>
     <w:p>
@@ -152,7 +206,7 @@
           <w:b/>
           <w:sz w:val="22"/>
         </w:rPr>
-        <w:t>Step 2: Start the checkout and enter email</w:t>
+        <w:t>Step 2: Browse the store and fill the cart</w:t>
       </w:r>
     </w:p>
     <w:p>
@@ -164,7 +218,7 @@
           <w:color w:val="000000"/>
           <w:sz w:val="22"/>
         </w:rPr>
-        <w:t>The Click to Pay screen shows the Amount, Gateway, Order ID and Session ID. Enter the email address and select Continue with Email (or choose a saved / new card).</w:t>
+        <w:t xml:space="preserve">From the home page, open a product and select Add to Cart, then open the cart (top right). The total shown is the amount that will be charged. Select Checkout with Click to Pay.</w:t>
       </w:r>
     </w:p>
     <w:p>
@@ -175,8 +229,8 @@
       <w:r>
         <w:drawing>
           <wp:inline xmlns:a="http://schemas.openxmlformats.org/drawingml/2006/main" xmlns:pic="http://schemas.openxmlformats.org/drawingml/2006/picture">
-            <wp:extent cx="6400800" cy="6486030"/>
-            <wp:docPr id="1" name="Picture 1"/>
+            <wp:extent cx="6400800" cy="4112514"/>
+            <wp:docPr id="2" name="Picture 2"/>
             <wp:cNvGraphicFramePr>
               <a:graphicFrameLocks noChangeAspect="1"/>
             </wp:cNvGraphicFramePr>
@@ -184,11 +238,11 @@
               <a:graphicData uri="http://schemas.openxmlformats.org/drawingml/2006/picture">
                 <pic:pic>
                   <pic:nvPicPr>
-                    <pic:cNvPr id="0" name="Screenshot 2026-08-22 at 12.08.56.png"/>
+                    <pic:cNvPr id="0" name="image2.png"/>
                     <pic:cNvPicPr/>
                   </pic:nvPicPr>
                   <pic:blipFill>
-                    <a:blip r:embed="rId10"/>
+                    <a:blip r:embed="rIdImg2"/>
                     <a:stretch>
                       <a:fillRect/>
                     </a:stretch>
@@ -196,7 +250,7 @@
                   <pic:spPr>
                     <a:xfrm>
                       <a:off x="0" y="0"/>
-                      <a:ext cx="6400800" cy="6486030"/>
+                      <a:ext cx="6400800" cy="4112514"/>
                     </a:xfrm>
                     <a:prstGeom prst="rect"/>
                   </pic:spPr>
@@ -218,7 +272,7 @@
           <w:color w:val="595959"/>
           <w:sz w:val="18"/>
         </w:rPr>
-        <w:t>Click to Pay (Hosted Session) — session details; enter email to continue.</w:t>
+        <w:t xml:space="preserve">TechGear home page — the Demo strip lists the steps.</w:t>
       </w:r>
     </w:p>
     <w:p>
@@ -229,8 +283,8 @@
       <w:r>
         <w:drawing>
           <wp:inline xmlns:a="http://schemas.openxmlformats.org/drawingml/2006/main" xmlns:pic="http://schemas.openxmlformats.org/drawingml/2006/picture">
-            <wp:extent cx="6400800" cy="6034585"/>
-            <wp:docPr id="2" name="Picture 2"/>
+            <wp:extent cx="6400800" cy="4112514"/>
+            <wp:docPr id="3" name="Picture 3"/>
             <wp:cNvGraphicFramePr>
               <a:graphicFrameLocks noChangeAspect="1"/>
             </wp:cNvGraphicFramePr>
@@ -238,11 +292,11 @@
               <a:graphicData uri="http://schemas.openxmlformats.org/drawingml/2006/picture">
                 <pic:pic>
                   <pic:nvPicPr>
-                    <pic:cNvPr id="0" name="Screenshot 2026-08-22 at 12.09.16.png"/>
+                    <pic:cNvPr id="0" name="image3.png"/>
                     <pic:cNvPicPr/>
                   </pic:nvPicPr>
                   <pic:blipFill>
-                    <a:blip r:embed="rId11"/>
+                    <a:blip r:embed="rIdImg3"/>
                     <a:stretch>
                       <a:fillRect/>
                     </a:stretch>
@@ -250,7 +304,7 @@
                   <pic:spPr>
                     <a:xfrm>
                       <a:off x="0" y="0"/>
-                      <a:ext cx="6400800" cy="6034585"/>
+                      <a:ext cx="6400800" cy="4112514"/>
                     </a:xfrm>
                     <a:prstGeom prst="rect"/>
                   </pic:spPr>
@@ -272,7 +326,7 @@
           <w:color w:val="595959"/>
           <w:sz w:val="18"/>
         </w:rPr>
-        <w:t>Email entered — Continue with Email (or use a saved / new card).</w:t>
+        <w:t xml:space="preserve">Cart with two items ($398); select Checkout with Click to Pay.</w:t>
       </w:r>
     </w:p>
     <w:p>
@@ -284,7 +338,7 @@
           <w:b/>
           <w:sz w:val="22"/>
         </w:rPr>
-        <w:t>Step 3: Look up cards and verify</w:t>
+        <w:t>Step 3: Enter your email</w:t>
       </w:r>
     </w:p>
     <w:p>
@@ -296,7 +350,7 @@
           <w:color w:val="000000"/>
           <w:sz w:val="22"/>
         </w:rPr>
-        <w:t>Select Lookup / Checkout with existing card. Click to Pay finds saved cards and sends a one-time code to the registered mobile number; enter the code and Continue.</w:t>
+        <w:t xml:space="preserve">The TechGear checkout has two steps: 01 Contact and 02 Payment. Enter the email address registered with Click to Pay and select Continue with Click to Pay (or choose Use a card saved on this device / Add a new card).</w:t>
       </w:r>
     </w:p>
     <w:p>
@@ -307,8 +361,8 @@
       <w:r>
         <w:drawing>
           <wp:inline xmlns:a="http://schemas.openxmlformats.org/drawingml/2006/main" xmlns:pic="http://schemas.openxmlformats.org/drawingml/2006/picture">
-            <wp:extent cx="5624266" cy="7680960"/>
-            <wp:docPr id="3" name="Picture 3"/>
+            <wp:extent cx="6400800" cy="4112514"/>
+            <wp:docPr id="4" name="Picture 4"/>
             <wp:cNvGraphicFramePr>
               <a:graphicFrameLocks noChangeAspect="1"/>
             </wp:cNvGraphicFramePr>
@@ -316,11 +370,11 @@
               <a:graphicData uri="http://schemas.openxmlformats.org/drawingml/2006/picture">
                 <pic:pic>
                   <pic:nvPicPr>
-                    <pic:cNvPr id="0" name="Screenshot 2026-08-22 at 12.09.35.png"/>
+                    <pic:cNvPr id="0" name="image4.png"/>
                     <pic:cNvPicPr/>
                   </pic:nvPicPr>
                   <pic:blipFill>
-                    <a:blip r:embed="rId12"/>
+                    <a:blip r:embed="rIdImg4"/>
                     <a:stretch>
                       <a:fillRect/>
                     </a:stretch>
@@ -328,7 +382,7 @@
                   <pic:spPr>
                     <a:xfrm>
                       <a:off x="0" y="0"/>
-                      <a:ext cx="5624266" cy="7680960"/>
+                      <a:ext cx="6400800" cy="4112514"/>
                     </a:xfrm>
                     <a:prstGeom prst="rect"/>
                   </pic:spPr>
@@ -350,7 +404,31 @@
           <w:color w:val="595959"/>
           <w:sz w:val="18"/>
         </w:rPr>
-        <w:t>Look up existing cards; Click to Pay sends a one-time code.</w:t>
+        <w:t xml:space="preserve">Checkout — email entered; select Continue with Click to Pay.</w:t>
+      </w:r>
+    </w:p>
+    <w:p>
+      <w:pPr>
+        <w:spacing w:before="200" w:after="40"/>
+      </w:pPr>
+      <w:r>
+        <w:rPr>
+          <w:b/>
+          <w:sz w:val="22"/>
+        </w:rPr>
+        <w:t>Step 4: Look up cards and verify</w:t>
+      </w:r>
+    </w:p>
+    <w:p>
+      <w:pPr>
+        <w:spacing w:after="120"/>
+      </w:pPr>
+      <w:r>
+        <w:rPr>
+          <w:color w:val="000000"/>
+          <w:sz w:val="22"/>
+        </w:rPr>
+        <w:t xml:space="preserve">Click to Pay looks up the email and sends a one-time code to the registered mobile number. The verification appears inside the Payment step; enter the code and select Continue. If needed, select Checkout with existing card.</w:t>
       </w:r>
     </w:p>
     <w:p>
@@ -361,8 +439,8 @@
       <w:r>
         <w:drawing>
           <wp:inline xmlns:a="http://schemas.openxmlformats.org/drawingml/2006/main" xmlns:pic="http://schemas.openxmlformats.org/drawingml/2006/picture">
-            <wp:extent cx="5233005" cy="7680960"/>
-            <wp:docPr id="4" name="Picture 4"/>
+            <wp:extent cx="6400800" cy="4112514"/>
+            <wp:docPr id="5" name="Picture 5"/>
             <wp:cNvGraphicFramePr>
               <a:graphicFrameLocks noChangeAspect="1"/>
             </wp:cNvGraphicFramePr>
@@ -370,11 +448,11 @@
               <a:graphicData uri="http://schemas.openxmlformats.org/drawingml/2006/picture">
                 <pic:pic>
                   <pic:nvPicPr>
-                    <pic:cNvPr id="0" name="Screenshot 2026-08-22 at 12.09.58.png"/>
+                    <pic:cNvPr id="0" name="image5.png"/>
                     <pic:cNvPicPr/>
                   </pic:nvPicPr>
                   <pic:blipFill>
-                    <a:blip r:embed="rId13"/>
+                    <a:blip r:embed="rIdImg5"/>
                     <a:stretch>
                       <a:fillRect/>
                     </a:stretch>
@@ -382,7 +460,7 @@
                   <pic:spPr>
                     <a:xfrm>
                       <a:off x="0" y="0"/>
-                      <a:ext cx="5233005" cy="7680960"/>
+                      <a:ext cx="6400800" cy="4112514"/>
                     </a:xfrm>
                     <a:prstGeom prst="rect"/>
                   </pic:spPr>
@@ -404,31 +482,7 @@
           <w:color w:val="595959"/>
           <w:sz w:val="18"/>
         </w:rPr>
-        <w:t>Enter the one-time code and select Continue.</w:t>
-      </w:r>
-    </w:p>
-    <w:p>
-      <w:pPr>
-        <w:spacing w:before="200" w:after="40"/>
-      </w:pPr>
-      <w:r>
-        <w:rPr>
-          <w:b/>
-          <w:sz w:val="22"/>
-        </w:rPr>
-        <w:t>Step 4: Select a card and review</w:t>
-      </w:r>
-    </w:p>
-    <w:p>
-      <w:pPr>
-        <w:spacing w:after="120"/>
-      </w:pPr>
-      <w:r>
-        <w:rPr>
-          <w:color w:val="000000"/>
-          <w:sz w:val="22"/>
-        </w:rPr>
-        <w:t>Choose a card from the wallet and review the payment (optionally “remember me in this browser for faster checkouts”).</w:t>
+        <w:t xml:space="preserve">Click to Pay ready in the Payment step.</w:t>
       </w:r>
     </w:p>
     <w:p>
@@ -439,8 +493,8 @@
       <w:r>
         <w:drawing>
           <wp:inline xmlns:a="http://schemas.openxmlformats.org/drawingml/2006/main" xmlns:pic="http://schemas.openxmlformats.org/drawingml/2006/picture">
-            <wp:extent cx="5774620" cy="7680959"/>
-            <wp:docPr id="5" name="Picture 5"/>
+            <wp:extent cx="6400800" cy="4112514"/>
+            <wp:docPr id="6" name="Picture 6"/>
             <wp:cNvGraphicFramePr>
               <a:graphicFrameLocks noChangeAspect="1"/>
             </wp:cNvGraphicFramePr>
@@ -448,11 +502,11 @@
               <a:graphicData uri="http://schemas.openxmlformats.org/drawingml/2006/picture">
                 <pic:pic>
                   <pic:nvPicPr>
-                    <pic:cNvPr id="0" name="Screenshot 2026-08-22 at 12.10.09.png"/>
+                    <pic:cNvPr id="0" name="image6.png"/>
                     <pic:cNvPicPr/>
                   </pic:nvPicPr>
                   <pic:blipFill>
-                    <a:blip r:embed="rId14"/>
+                    <a:blip r:embed="rIdImg6"/>
                     <a:stretch>
                       <a:fillRect/>
                     </a:stretch>
@@ -460,7 +514,7 @@
                   <pic:spPr>
                     <a:xfrm>
                       <a:off x="0" y="0"/>
-                      <a:ext cx="5774620" cy="7680959"/>
+                      <a:ext cx="6400800" cy="4112514"/>
                     </a:xfrm>
                     <a:prstGeom prst="rect"/>
                   </pic:spPr>
@@ -482,7 +536,31 @@
           <w:color w:val="595959"/>
           <w:sz w:val="18"/>
         </w:rPr>
-        <w:t>Select a card from the Click to Pay wallet.</w:t>
+        <w:t xml:space="preserve">Click to Pay found the cards — enter the one-time code.</w:t>
+      </w:r>
+    </w:p>
+    <w:p>
+      <w:pPr>
+        <w:spacing w:before="200" w:after="40"/>
+      </w:pPr>
+      <w:r>
+        <w:rPr>
+          <w:b/>
+          <w:sz w:val="22"/>
+        </w:rPr>
+        <w:t>Step 5: Select a card and review</w:t>
+      </w:r>
+    </w:p>
+    <w:p>
+      <w:pPr>
+        <w:spacing w:after="120"/>
+      </w:pPr>
+      <w:r>
+        <w:rPr>
+          <w:color w:val="000000"/>
+          <w:sz w:val="22"/>
+        </w:rPr>
+        <w:t xml:space="preserve">Choose a card from the Click to Pay wallet, then review the payment (optionally “Remember me in this browser for faster checkouts”). These Click to Pay screens appear inside the TechGear Payment step.</w:t>
       </w:r>
     </w:p>
     <w:p>
@@ -493,8 +571,8 @@
       <w:r>
         <w:drawing>
           <wp:inline xmlns:a="http://schemas.openxmlformats.org/drawingml/2006/main" xmlns:pic="http://schemas.openxmlformats.org/drawingml/2006/picture">
-            <wp:extent cx="5457943" cy="7680959"/>
-            <wp:docPr id="6" name="Picture 6"/>
+            <wp:extent cx="3840480" cy="3253740"/>
+            <wp:docPr id="7" name="Picture 7"/>
             <wp:cNvGraphicFramePr>
               <a:graphicFrameLocks noChangeAspect="1"/>
             </wp:cNvGraphicFramePr>
@@ -502,11 +580,11 @@
               <a:graphicData uri="http://schemas.openxmlformats.org/drawingml/2006/picture">
                 <pic:pic>
                   <pic:nvPicPr>
-                    <pic:cNvPr id="0" name="Screenshot 2026-08-22 at 12.10.21.png"/>
+                    <pic:cNvPr id="0" name="image7.png"/>
                     <pic:cNvPicPr/>
                   </pic:nvPicPr>
                   <pic:blipFill>
-                    <a:blip r:embed="rId15"/>
+                    <a:blip r:embed="rIdImg7"/>
                     <a:stretch>
                       <a:fillRect/>
                     </a:stretch>
@@ -514,7 +592,7 @@
                   <pic:spPr>
                     <a:xfrm>
                       <a:off x="0" y="0"/>
-                      <a:ext cx="5457943" cy="7680959"/>
+                      <a:ext cx="3840480" cy="3253740"/>
                     </a:xfrm>
                     <a:prstGeom prst="rect"/>
                   </pic:spPr>
@@ -536,31 +614,7 @@
           <w:color w:val="595959"/>
           <w:sz w:val="18"/>
         </w:rPr>
-        <w:t>Review your payment (optionally remember this browser).</w:t>
-      </w:r>
-    </w:p>
-    <w:p>
-      <w:pPr>
-        <w:spacing w:before="200" w:after="40"/>
-      </w:pPr>
-      <w:r>
-        <w:rPr>
-          <w:b/>
-          <w:sz w:val="22"/>
-        </w:rPr>
-        <w:t>Step 5: Confirmation</w:t>
-      </w:r>
-    </w:p>
-    <w:p>
-      <w:pPr>
-        <w:spacing w:after="120"/>
-      </w:pPr>
-      <w:r>
-        <w:rPr>
-          <w:color w:val="000000"/>
-          <w:sz w:val="22"/>
-        </w:rPr>
-        <w:t>The demo shows Payment Approved with the amount, Order ID and gateway code (e.g. APPROVED). The Network Console traces the sequence: Create Session → Update Session (attach amount + order id) → Payment Options Inquiry → Link Wallet to Session → Charge the Card (PAY).</w:t>
+        <w:t xml:space="preserve">Select a card from the Click to Pay wallet.</w:t>
       </w:r>
     </w:p>
     <w:p>
@@ -571,8 +625,8 @@
       <w:r>
         <w:drawing>
           <wp:inline xmlns:a="http://schemas.openxmlformats.org/drawingml/2006/main" xmlns:pic="http://schemas.openxmlformats.org/drawingml/2006/picture">
-            <wp:extent cx="6400800" cy="6508226"/>
-            <wp:docPr id="7" name="Picture 7"/>
+            <wp:extent cx="3840480" cy="3787140"/>
+            <wp:docPr id="8" name="Picture 8"/>
             <wp:cNvGraphicFramePr>
               <a:graphicFrameLocks noChangeAspect="1"/>
             </wp:cNvGraphicFramePr>
@@ -580,11 +634,11 @@
               <a:graphicData uri="http://schemas.openxmlformats.org/drawingml/2006/picture">
                 <pic:pic>
                   <pic:nvPicPr>
-                    <pic:cNvPr id="0" name="Screenshot 2026-08-22 at 12.10.30.png"/>
+                    <pic:cNvPr id="0" name="image8.png"/>
                     <pic:cNvPicPr/>
                   </pic:nvPicPr>
                   <pic:blipFill>
-                    <a:blip r:embed="rId16"/>
+                    <a:blip r:embed="rIdImg8"/>
                     <a:stretch>
                       <a:fillRect/>
                     </a:stretch>
@@ -592,7 +646,7 @@
                   <pic:spPr>
                     <a:xfrm>
                       <a:off x="0" y="0"/>
-                      <a:ext cx="6400800" cy="6508226"/>
+                      <a:ext cx="3840480" cy="3787140"/>
                     </a:xfrm>
                     <a:prstGeom prst="rect"/>
                   </pic:spPr>
@@ -614,7 +668,31 @@
           <w:color w:val="595959"/>
           <w:sz w:val="18"/>
         </w:rPr>
-        <w:t>Processing the payment.</w:t>
+        <w:t xml:space="preserve">Review your payment (optionally remember this browser).</w:t>
+      </w:r>
+    </w:p>
+    <w:p>
+      <w:pPr>
+        <w:spacing w:before="200" w:after="40"/>
+      </w:pPr>
+      <w:r>
+        <w:rPr>
+          <w:b/>
+          <w:sz w:val="22"/>
+        </w:rPr>
+        <w:t>Step 6: Confirmation</w:t>
+      </w:r>
+    </w:p>
+    <w:p>
+      <w:pPr>
+        <w:spacing w:after="120"/>
+      </w:pPr>
+      <w:r>
+        <w:rPr>
+          <w:color w:val="000000"/>
+          <w:sz w:val="22"/>
+        </w:rPr>
+        <w:t xml:space="preserve">The TechGear receipt confirms the order with the order number, card brand, gateway result (e.g. APPROVED), items and total, and the cart is emptied.</w:t>
       </w:r>
     </w:p>
     <w:p>
@@ -625,8 +703,8 @@
       <w:r>
         <w:drawing>
           <wp:inline xmlns:a="http://schemas.openxmlformats.org/drawingml/2006/main" xmlns:pic="http://schemas.openxmlformats.org/drawingml/2006/picture">
-            <wp:extent cx="6400800" cy="3677055"/>
-            <wp:docPr id="8" name="Picture 8"/>
+            <wp:extent cx="6400800" cy="4112514"/>
+            <wp:docPr id="9" name="Picture 9"/>
             <wp:cNvGraphicFramePr>
               <a:graphicFrameLocks noChangeAspect="1"/>
             </wp:cNvGraphicFramePr>
@@ -634,11 +712,11 @@
               <a:graphicData uri="http://schemas.openxmlformats.org/drawingml/2006/picture">
                 <pic:pic>
                   <pic:nvPicPr>
-                    <pic:cNvPr id="0" name="Screenshot 2026-08-22 at 12.10.40.png"/>
+                    <pic:cNvPr id="0" name="image9.png"/>
                     <pic:cNvPicPr/>
                   </pic:nvPicPr>
                   <pic:blipFill>
-                    <a:blip r:embed="rId17"/>
+                    <a:blip r:embed="rIdImg9"/>
                     <a:stretch>
                       <a:fillRect/>
                     </a:stretch>
@@ -646,7 +724,7 @@
                   <pic:spPr>
                     <a:xfrm>
                       <a:off x="0" y="0"/>
-                      <a:ext cx="6400800" cy="3677055"/>
+                      <a:ext cx="6400800" cy="4112514"/>
                     </a:xfrm>
                     <a:prstGeom prst="rect"/>
                   </pic:spPr>
@@ -668,7 +746,31 @@
           <w:color w:val="595959"/>
           <w:sz w:val="18"/>
         </w:rPr>
-        <w:t>Payment Approved — gateway code and the Network Console call trace.</w:t>
+        <w:t xml:space="preserve">TechGear receipt — payment approved with Click to Pay.</w:t>
+      </w:r>
+    </w:p>
+    <w:p>
+      <w:pPr>
+        <w:spacing w:before="200" w:after="40"/>
+      </w:pPr>
+      <w:r>
+        <w:rPr>
+          <w:b/>
+          <w:sz w:val="22"/>
+        </w:rPr>
+        <w:t>Behind the scenes: Developer view</w:t>
+      </w:r>
+    </w:p>
+    <w:p>
+      <w:pPr>
+        <w:spacing w:after="120"/>
+      </w:pPr>
+      <w:r>
+        <w:rPr>
+          <w:color w:val="000000"/>
+          <w:sz w:val="22"/>
+        </w:rPr>
+        <w:t xml:space="preserve">The Developer view tab on the right edge of the checkout and receipt pages opens a drawer with the amount, gateway, order and session IDs. Network calls traces the sequence: Create Session → Update Session (attach amount + order id) → Payment Options Inquiry → Link Wallet to Session → Charge the Card (PAY). Flow diagram shows the whole sequence.</w:t>
       </w:r>
     </w:p>
     <w:p>
@@ -688,7 +790,61 @@
           <w:color w:val="C00000"/>
           <w:sz w:val="22"/>
         </w:rPr>
-        <w:t>The Network Console is a useful teaching aid — it shows the exact gateway API sequence behind a Hosted Session Click to Pay transaction.</w:t>
+        <w:t xml:space="preserve">The Developer view is a useful teaching aid — it shows the exact gateway API sequence behind a Hosted Session Click to Pay transaction.</w:t>
+      </w:r>
+    </w:p>
+    <w:p>
+      <w:pPr>
+        <w:spacing w:before="80"/>
+        <w:jc w:val="center"/>
+      </w:pPr>
+      <w:r>
+        <w:drawing>
+          <wp:inline xmlns:a="http://schemas.openxmlformats.org/drawingml/2006/main" xmlns:pic="http://schemas.openxmlformats.org/drawingml/2006/picture">
+            <wp:extent cx="6400800" cy="4112514"/>
+            <wp:docPr id="10" name="Picture 10"/>
+            <wp:cNvGraphicFramePr>
+              <a:graphicFrameLocks noChangeAspect="1"/>
+            </wp:cNvGraphicFramePr>
+            <a:graphic>
+              <a:graphicData uri="http://schemas.openxmlformats.org/drawingml/2006/picture">
+                <pic:pic>
+                  <pic:nvPicPr>
+                    <pic:cNvPr id="0" name="image10.png"/>
+                    <pic:cNvPicPr/>
+                  </pic:nvPicPr>
+                  <pic:blipFill>
+                    <a:blip r:embed="rIdImg10"/>
+                    <a:stretch>
+                      <a:fillRect/>
+                    </a:stretch>
+                  </pic:blipFill>
+                  <pic:spPr>
+                    <a:xfrm>
+                      <a:off x="0" y="0"/>
+                      <a:ext cx="6400800" cy="4112514"/>
+                    </a:xfrm>
+                    <a:prstGeom prst="rect"/>
+                  </pic:spPr>
+                </pic:pic>
+              </a:graphicData>
+            </a:graphic>
+          </wp:inline>
+        </w:drawing>
+      </w:r>
+    </w:p>
+    <w:p>
+      <w:pPr>
+        <w:spacing w:after="200"/>
+        <w:jc w:val="center"/>
+      </w:pPr>
+      <w:r>
+        <w:rPr>
+          <w:i/>
+          <w:color w:val="595959"/>
+          <w:sz w:val="18"/>
+        </w:rPr>
+        <w:t xml:space="preserve">Developer view — the gateway calls behind Click to Pay.</w:t>
       </w:r>
     </w:p>
     <w:p>

</xml_diff>